<commit_message>
Full CV report: notebook expanded with all 7 figures + 10 sections; docx tables fixed (no empty rows), figures embedded; scripts removed
</commit_message>
<xml_diff>
--- a/report/cross_validation_report.docx
+++ b/report/cross_validation_report.docx
@@ -15,7 +15,7 @@
         <w:rPr>
           <w:b w:val="0"/>
         </w:rPr>
-        <w:t>Diabetes_ML · Pima Indians Diabetes dataset · stratified 5-fold cross-validation on a Dask distributed cluster (4 worker processes). Author: Oluchi-Otuadinma.</w:t>
+        <w:t>Diabetes_ML · Pima Indians Diabetes dataset · stratified 5-fold cross-validation on a Dask distributed cluster (1 scheduler + 4 worker processes). Author: Oluchi-Otuadinma. Companion notebook with the live code: notebooks/cross_validation_report.ipynb</w:t>
       </w:r>
     </w:p>
     <w:p>
@@ -31,7 +31,7 @@
         <w:rPr>
           <w:b w:val="0"/>
         </w:rPr>
-        <w:t>768 rows x 9 columns (54 KB in memory), no duplicates. Class balance: 500 non-diabetic / 268 diabetic (34.9% positive) — moderately imbalanced, handled with class weighting and stratified folds. Biologically impossible zeros treated as missing: Insulin 48.7%, SkinThickness 29.6%, BloodPressure 4.6%, BMI 1.4%, Glucose 0.7%. Feature engineering raises the table to 25 features (missingness flags, median imputation, insulin-resistance composites Glucose x Age / Insulin x BMI / QUICKI, clinical bins).</w:t>
+        <w:t>768 rows x 9 columns (54 KB in memory), no duplicate rows. Class balance: 500 non-diabetic / 268 diabetic (34.9% positive) — moderately imbalanced, handled with class weighting and stratified folds. Biologically impossible zeros treated as missing: Insulin 48.7%, SkinThickness 29.6%, BloodPressure 4.6%, BMI 1.4%, Glucose 0.7%. Feature engineering raises the table to 25 features (missingness flags, median imputation, insulin-resistance composites Glucose x Age / Insulin x BMI / QUICKI, clinical bins per ADA glucose / WHO BMI thresholds).</w:t>
       </w:r>
     </w:p>
     <w:p>
@@ -47,7 +47,7 @@
         <w:rPr>
           <w:b w:val="0"/>
         </w:rPr>
-        <w:t>StratifiedKFold (5 folds, prevalence preserved at ~34.9% per fold; test folds n=154/153). Models: RandomForest (400 trees, class_weight=balanced) vs Logistic Regression (C=1, balanced). Chi-squared feature selection at k = 8 / 12 / all-25. 30 train/score jobs fanned out to the cluster via client.map. High-recall screening mode: per-fold decision threshold tuned on out-of-fold training predictions to reach recall &gt;= 0.90, applied untouched to the test fold (no leakage).</w:t>
+        <w:t>StratifiedKFold, 5 folds (prevalence preserved at ~34.9% per fold; test folds n=154/153). Models: RandomForest (400 trees, class_weight=balanced) vs Logistic Regression (C=1, balanced). Chi-squared feature selection at k = 8 / 12 / all-25. 30 train/score jobs fanned out to the cluster via client.map. High-recall screening mode: per-fold decision threshold tuned on out-of-fold training predictions to reach recall &gt;= 0.90, applied untouched to the test fold (no leakage).</w:t>
       </w:r>
     </w:p>
     <w:p>
@@ -137,198 +137,6 @@
               <w:t>f1</w:t>
             </w:r>
           </w:p>
-        </w:tc>
-      </w:tr>
-      <w:tr>
-        <w:tc>
-          <w:tcPr>
-            <w:tcW w:type="dxa" w:w="1728"/>
-          </w:tcPr>
-          <w:p/>
-        </w:tc>
-        <w:tc>
-          <w:tcPr>
-            <w:tcW w:type="dxa" w:w="1728"/>
-          </w:tcPr>
-          <w:p/>
-        </w:tc>
-        <w:tc>
-          <w:tcPr>
-            <w:tcW w:type="dxa" w:w="1728"/>
-          </w:tcPr>
-          <w:p/>
-        </w:tc>
-        <w:tc>
-          <w:tcPr>
-            <w:tcW w:type="dxa" w:w="1728"/>
-          </w:tcPr>
-          <w:p/>
-        </w:tc>
-        <w:tc>
-          <w:tcPr>
-            <w:tcW w:type="dxa" w:w="1728"/>
-          </w:tcPr>
-          <w:p/>
-        </w:tc>
-      </w:tr>
-      <w:tr>
-        <w:tc>
-          <w:tcPr>
-            <w:tcW w:type="dxa" w:w="1728"/>
-          </w:tcPr>
-          <w:p/>
-        </w:tc>
-        <w:tc>
-          <w:tcPr>
-            <w:tcW w:type="dxa" w:w="1728"/>
-          </w:tcPr>
-          <w:p/>
-        </w:tc>
-        <w:tc>
-          <w:tcPr>
-            <w:tcW w:type="dxa" w:w="1728"/>
-          </w:tcPr>
-          <w:p/>
-        </w:tc>
-        <w:tc>
-          <w:tcPr>
-            <w:tcW w:type="dxa" w:w="1728"/>
-          </w:tcPr>
-          <w:p/>
-        </w:tc>
-        <w:tc>
-          <w:tcPr>
-            <w:tcW w:type="dxa" w:w="1728"/>
-          </w:tcPr>
-          <w:p/>
-        </w:tc>
-      </w:tr>
-      <w:tr>
-        <w:tc>
-          <w:tcPr>
-            <w:tcW w:type="dxa" w:w="1728"/>
-          </w:tcPr>
-          <w:p/>
-        </w:tc>
-        <w:tc>
-          <w:tcPr>
-            <w:tcW w:type="dxa" w:w="1728"/>
-          </w:tcPr>
-          <w:p/>
-        </w:tc>
-        <w:tc>
-          <w:tcPr>
-            <w:tcW w:type="dxa" w:w="1728"/>
-          </w:tcPr>
-          <w:p/>
-        </w:tc>
-        <w:tc>
-          <w:tcPr>
-            <w:tcW w:type="dxa" w:w="1728"/>
-          </w:tcPr>
-          <w:p/>
-        </w:tc>
-        <w:tc>
-          <w:tcPr>
-            <w:tcW w:type="dxa" w:w="1728"/>
-          </w:tcPr>
-          <w:p/>
-        </w:tc>
-      </w:tr>
-      <w:tr>
-        <w:tc>
-          <w:tcPr>
-            <w:tcW w:type="dxa" w:w="1728"/>
-          </w:tcPr>
-          <w:p/>
-        </w:tc>
-        <w:tc>
-          <w:tcPr>
-            <w:tcW w:type="dxa" w:w="1728"/>
-          </w:tcPr>
-          <w:p/>
-        </w:tc>
-        <w:tc>
-          <w:tcPr>
-            <w:tcW w:type="dxa" w:w="1728"/>
-          </w:tcPr>
-          <w:p/>
-        </w:tc>
-        <w:tc>
-          <w:tcPr>
-            <w:tcW w:type="dxa" w:w="1728"/>
-          </w:tcPr>
-          <w:p/>
-        </w:tc>
-        <w:tc>
-          <w:tcPr>
-            <w:tcW w:type="dxa" w:w="1728"/>
-          </w:tcPr>
-          <w:p/>
-        </w:tc>
-      </w:tr>
-      <w:tr>
-        <w:tc>
-          <w:tcPr>
-            <w:tcW w:type="dxa" w:w="1728"/>
-          </w:tcPr>
-          <w:p/>
-        </w:tc>
-        <w:tc>
-          <w:tcPr>
-            <w:tcW w:type="dxa" w:w="1728"/>
-          </w:tcPr>
-          <w:p/>
-        </w:tc>
-        <w:tc>
-          <w:tcPr>
-            <w:tcW w:type="dxa" w:w="1728"/>
-          </w:tcPr>
-          <w:p/>
-        </w:tc>
-        <w:tc>
-          <w:tcPr>
-            <w:tcW w:type="dxa" w:w="1728"/>
-          </w:tcPr>
-          <w:p/>
-        </w:tc>
-        <w:tc>
-          <w:tcPr>
-            <w:tcW w:type="dxa" w:w="1728"/>
-          </w:tcPr>
-          <w:p/>
-        </w:tc>
-      </w:tr>
-      <w:tr>
-        <w:tc>
-          <w:tcPr>
-            <w:tcW w:type="dxa" w:w="1728"/>
-          </w:tcPr>
-          <w:p/>
-        </w:tc>
-        <w:tc>
-          <w:tcPr>
-            <w:tcW w:type="dxa" w:w="1728"/>
-          </w:tcPr>
-          <w:p/>
-        </w:tc>
-        <w:tc>
-          <w:tcPr>
-            <w:tcW w:type="dxa" w:w="1728"/>
-          </w:tcPr>
-          <w:p/>
-        </w:tc>
-        <w:tc>
-          <w:tcPr>
-            <w:tcW w:type="dxa" w:w="1728"/>
-          </w:tcPr>
-          <w:p/>
-        </w:tc>
-        <w:tc>
-          <w:tcPr>
-            <w:tcW w:type="dxa" w:w="1728"/>
-          </w:tcPr>
-          <w:p/>
         </w:tc>
       </w:tr>
       <w:tr>
@@ -656,7 +464,79 @@
         <w:rPr>
           <w:b/>
         </w:rPr>
-        <w:t>Logistic Regression on all 25 features leads ROC-AUC (0.8415); RandomForest k=12 leads PR-AUC (0.736) and balanced accuracy (0.757).</w:t>
+        <w:t>Logistic Regression on all 25 features leads ROC-AUC (0.8415); RandomForest k=12 leads PR-AUC (0.736) and balanced accuracy (0.757). All gaps are within fold-to-fold noise (section 6).</w:t>
+      </w:r>
+    </w:p>
+    <w:p>
+      <w:r>
+        <w:drawing>
+          <wp:inline xmlns:a="http://schemas.openxmlformats.org/drawingml/2006/main" xmlns:pic="http://schemas.openxmlformats.org/drawingml/2006/picture">
+            <wp:extent cx="5943600" cy="2296909"/>
+            <wp:docPr id="1" name="Picture 1"/>
+            <wp:cNvGraphicFramePr>
+              <a:graphicFrameLocks noChangeAspect="1"/>
+            </wp:cNvGraphicFramePr>
+            <a:graphic>
+              <a:graphicData uri="http://schemas.openxmlformats.org/drawingml/2006/picture">
+                <pic:pic>
+                  <pic:nvPicPr>
+                    <pic:cNvPr id="0" name="metric_trends.png"/>
+                    <pic:cNvPicPr/>
+                  </pic:nvPicPr>
+                  <pic:blipFill>
+                    <a:blip r:embed="rId9"/>
+                    <a:stretch>
+                      <a:fillRect/>
+                    </a:stretch>
+                  </pic:blipFill>
+                  <pic:spPr>
+                    <a:xfrm>
+                      <a:off x="0" y="0"/>
+                      <a:ext cx="5943600" cy="2296909"/>
+                    </a:xfrm>
+                    <a:prstGeom prst="rect"/>
+                  </pic:spPr>
+                </pic:pic>
+              </a:graphicData>
+            </a:graphic>
+          </wp:inline>
+        </w:drawing>
+      </w:r>
+    </w:p>
+    <w:p>
+      <w:r>
+        <w:drawing>
+          <wp:inline xmlns:a="http://schemas.openxmlformats.org/drawingml/2006/main" xmlns:pic="http://schemas.openxmlformats.org/drawingml/2006/picture">
+            <wp:extent cx="5029200" cy="2668812"/>
+            <wp:docPr id="2" name="Picture 2"/>
+            <wp:cNvGraphicFramePr>
+              <a:graphicFrameLocks noChangeAspect="1"/>
+            </wp:cNvGraphicFramePr>
+            <a:graphic>
+              <a:graphicData uri="http://schemas.openxmlformats.org/drawingml/2006/picture">
+                <pic:pic>
+                  <pic:nvPicPr>
+                    <pic:cNvPr id="0" name="fold_variance.png"/>
+                    <pic:cNvPicPr/>
+                  </pic:nvPicPr>
+                  <pic:blipFill>
+                    <a:blip r:embed="rId10"/>
+                    <a:stretch>
+                      <a:fillRect/>
+                    </a:stretch>
+                  </pic:blipFill>
+                  <pic:spPr>
+                    <a:xfrm>
+                      <a:off x="0" y="0"/>
+                      <a:ext cx="5029200" cy="2668812"/>
+                    </a:xfrm>
+                    <a:prstGeom prst="rect"/>
+                  </pic:spPr>
+                </pic:pic>
+              </a:graphicData>
+            </a:graphic>
+          </wp:inline>
+        </w:drawing>
       </w:r>
     </w:p>
     <w:p>
@@ -664,7 +544,103 @@
         <w:pStyle w:val="Heading1"/>
       </w:pPr>
       <w:r>
-        <w:t>4. High-recall screening mode (target recall &gt;= 90%)</w:t>
+        <w:t>4. Fold-level analysis</w:t>
+      </w:r>
+    </w:p>
+    <w:p>
+      <w:r>
+        <w:rPr>
+          <w:b w:val="0"/>
+        </w:rPr>
+        <w:t>Both models track each other within ~0.02 ROC-AUC on every fold; ROC-AUC drifts down toward fold 4 (0.87 -&gt; 0.80), whose test set is the hardest slice. ROC-AUC is the most stable metric (0.80-0.87) while PR-AUC/balanced accuracy/F1 swing more (~0.62-0.77) because they lean on the minority class. Diabetic prevalence sits exactly at 34.9% in every test fold, so fold-to-fold variation is sampling variance, not a design flaw.</w:t>
+      </w:r>
+    </w:p>
+    <w:p>
+      <w:r>
+        <w:drawing>
+          <wp:inline xmlns:a="http://schemas.openxmlformats.org/drawingml/2006/main" xmlns:pic="http://schemas.openxmlformats.org/drawingml/2006/picture">
+            <wp:extent cx="5029200" cy="2668812"/>
+            <wp:docPr id="3" name="Picture 3"/>
+            <wp:cNvGraphicFramePr>
+              <a:graphicFrameLocks noChangeAspect="1"/>
+            </wp:cNvGraphicFramePr>
+            <a:graphic>
+              <a:graphicData uri="http://schemas.openxmlformats.org/drawingml/2006/picture">
+                <pic:pic>
+                  <pic:nvPicPr>
+                    <pic:cNvPr id="0" name="error_decomposition.png"/>
+                    <pic:cNvPicPr/>
+                  </pic:nvPicPr>
+                  <pic:blipFill>
+                    <a:blip r:embed="rId11"/>
+                    <a:stretch>
+                      <a:fillRect/>
+                    </a:stretch>
+                  </pic:blipFill>
+                  <pic:spPr>
+                    <a:xfrm>
+                      <a:off x="0" y="0"/>
+                      <a:ext cx="5029200" cy="2668812"/>
+                    </a:xfrm>
+                    <a:prstGeom prst="rect"/>
+                  </pic:spPr>
+                </pic:pic>
+              </a:graphicData>
+            </a:graphic>
+          </wp:inline>
+        </w:drawing>
+      </w:r>
+    </w:p>
+    <w:p>
+      <w:r>
+        <w:drawing>
+          <wp:inline xmlns:a="http://schemas.openxmlformats.org/drawingml/2006/main" xmlns:pic="http://schemas.openxmlformats.org/drawingml/2006/picture">
+            <wp:extent cx="5029200" cy="2668812"/>
+            <wp:docPr id="4" name="Picture 4"/>
+            <wp:cNvGraphicFramePr>
+              <a:graphicFrameLocks noChangeAspect="1"/>
+            </wp:cNvGraphicFramePr>
+            <a:graphic>
+              <a:graphicData uri="http://schemas.openxmlformats.org/drawingml/2006/picture">
+                <pic:pic>
+                  <pic:nvPicPr>
+                    <pic:cNvPr id="0" name="stratification_check.png"/>
+                    <pic:cNvPicPr/>
+                  </pic:nvPicPr>
+                  <pic:blipFill>
+                    <a:blip r:embed="rId12"/>
+                    <a:stretch>
+                      <a:fillRect/>
+                    </a:stretch>
+                  </pic:blipFill>
+                  <pic:spPr>
+                    <a:xfrm>
+                      <a:off x="0" y="0"/>
+                      <a:ext cx="5029200" cy="2668812"/>
+                    </a:xfrm>
+                    <a:prstGeom prst="rect"/>
+                  </pic:spPr>
+                </pic:pic>
+              </a:graphicData>
+            </a:graphic>
+          </wp:inline>
+        </w:drawing>
+      </w:r>
+    </w:p>
+    <w:p>
+      <w:pPr>
+        <w:pStyle w:val="Heading1"/>
+      </w:pPr>
+      <w:r>
+        <w:t>5. High-recall screening mode (target recall &gt;= 90%)</w:t>
+      </w:r>
+    </w:p>
+    <w:p>
+      <w:r>
+        <w:rPr>
+          <w:b w:val="0"/>
+        </w:rPr>
+        <w:t>For medical screening, missed diabetics (false negatives) cost more than false alarms. Each fold's decision threshold is tuned on out-of-fold training predictions only, then applied to the untouched test fold.</w:t>
       </w:r>
     </w:p>
     <w:tbl>
@@ -704,7 +680,7 @@
               <w:rPr>
                 <w:b/>
               </w:rPr>
-              <w:t>recall_hr</w:t>
+              <w:t>recall @HR</w:t>
             </w:r>
           </w:p>
         </w:tc>
@@ -717,7 +693,7 @@
               <w:rPr>
                 <w:b/>
               </w:rPr>
-              <w:t>precision_hr</w:t>
+              <w:t>precision @HR</w:t>
             </w:r>
           </w:p>
         </w:tc>
@@ -730,7 +706,7 @@
               <w:rPr>
                 <w:b/>
               </w:rPr>
-              <w:t>f1_hr</w:t>
+              <w:t>F1 @HR</w:t>
             </w:r>
           </w:p>
         </w:tc>
@@ -746,198 +722,6 @@
               <w:t>threshold</w:t>
             </w:r>
           </w:p>
-        </w:tc>
-      </w:tr>
-      <w:tr>
-        <w:tc>
-          <w:tcPr>
-            <w:tcW w:type="dxa" w:w="1728"/>
-          </w:tcPr>
-          <w:p/>
-        </w:tc>
-        <w:tc>
-          <w:tcPr>
-            <w:tcW w:type="dxa" w:w="1728"/>
-          </w:tcPr>
-          <w:p/>
-        </w:tc>
-        <w:tc>
-          <w:tcPr>
-            <w:tcW w:type="dxa" w:w="1728"/>
-          </w:tcPr>
-          <w:p/>
-        </w:tc>
-        <w:tc>
-          <w:tcPr>
-            <w:tcW w:type="dxa" w:w="1728"/>
-          </w:tcPr>
-          <w:p/>
-        </w:tc>
-        <w:tc>
-          <w:tcPr>
-            <w:tcW w:type="dxa" w:w="1728"/>
-          </w:tcPr>
-          <w:p/>
-        </w:tc>
-      </w:tr>
-      <w:tr>
-        <w:tc>
-          <w:tcPr>
-            <w:tcW w:type="dxa" w:w="1728"/>
-          </w:tcPr>
-          <w:p/>
-        </w:tc>
-        <w:tc>
-          <w:tcPr>
-            <w:tcW w:type="dxa" w:w="1728"/>
-          </w:tcPr>
-          <w:p/>
-        </w:tc>
-        <w:tc>
-          <w:tcPr>
-            <w:tcW w:type="dxa" w:w="1728"/>
-          </w:tcPr>
-          <w:p/>
-        </w:tc>
-        <w:tc>
-          <w:tcPr>
-            <w:tcW w:type="dxa" w:w="1728"/>
-          </w:tcPr>
-          <w:p/>
-        </w:tc>
-        <w:tc>
-          <w:tcPr>
-            <w:tcW w:type="dxa" w:w="1728"/>
-          </w:tcPr>
-          <w:p/>
-        </w:tc>
-      </w:tr>
-      <w:tr>
-        <w:tc>
-          <w:tcPr>
-            <w:tcW w:type="dxa" w:w="1728"/>
-          </w:tcPr>
-          <w:p/>
-        </w:tc>
-        <w:tc>
-          <w:tcPr>
-            <w:tcW w:type="dxa" w:w="1728"/>
-          </w:tcPr>
-          <w:p/>
-        </w:tc>
-        <w:tc>
-          <w:tcPr>
-            <w:tcW w:type="dxa" w:w="1728"/>
-          </w:tcPr>
-          <w:p/>
-        </w:tc>
-        <w:tc>
-          <w:tcPr>
-            <w:tcW w:type="dxa" w:w="1728"/>
-          </w:tcPr>
-          <w:p/>
-        </w:tc>
-        <w:tc>
-          <w:tcPr>
-            <w:tcW w:type="dxa" w:w="1728"/>
-          </w:tcPr>
-          <w:p/>
-        </w:tc>
-      </w:tr>
-      <w:tr>
-        <w:tc>
-          <w:tcPr>
-            <w:tcW w:type="dxa" w:w="1728"/>
-          </w:tcPr>
-          <w:p/>
-        </w:tc>
-        <w:tc>
-          <w:tcPr>
-            <w:tcW w:type="dxa" w:w="1728"/>
-          </w:tcPr>
-          <w:p/>
-        </w:tc>
-        <w:tc>
-          <w:tcPr>
-            <w:tcW w:type="dxa" w:w="1728"/>
-          </w:tcPr>
-          <w:p/>
-        </w:tc>
-        <w:tc>
-          <w:tcPr>
-            <w:tcW w:type="dxa" w:w="1728"/>
-          </w:tcPr>
-          <w:p/>
-        </w:tc>
-        <w:tc>
-          <w:tcPr>
-            <w:tcW w:type="dxa" w:w="1728"/>
-          </w:tcPr>
-          <w:p/>
-        </w:tc>
-      </w:tr>
-      <w:tr>
-        <w:tc>
-          <w:tcPr>
-            <w:tcW w:type="dxa" w:w="1728"/>
-          </w:tcPr>
-          <w:p/>
-        </w:tc>
-        <w:tc>
-          <w:tcPr>
-            <w:tcW w:type="dxa" w:w="1728"/>
-          </w:tcPr>
-          <w:p/>
-        </w:tc>
-        <w:tc>
-          <w:tcPr>
-            <w:tcW w:type="dxa" w:w="1728"/>
-          </w:tcPr>
-          <w:p/>
-        </w:tc>
-        <w:tc>
-          <w:tcPr>
-            <w:tcW w:type="dxa" w:w="1728"/>
-          </w:tcPr>
-          <w:p/>
-        </w:tc>
-        <w:tc>
-          <w:tcPr>
-            <w:tcW w:type="dxa" w:w="1728"/>
-          </w:tcPr>
-          <w:p/>
-        </w:tc>
-      </w:tr>
-      <w:tr>
-        <w:tc>
-          <w:tcPr>
-            <w:tcW w:type="dxa" w:w="1728"/>
-          </w:tcPr>
-          <w:p/>
-        </w:tc>
-        <w:tc>
-          <w:tcPr>
-            <w:tcW w:type="dxa" w:w="1728"/>
-          </w:tcPr>
-          <w:p/>
-        </w:tc>
-        <w:tc>
-          <w:tcPr>
-            <w:tcW w:type="dxa" w:w="1728"/>
-          </w:tcPr>
-          <w:p/>
-        </w:tc>
-        <w:tc>
-          <w:tcPr>
-            <w:tcW w:type="dxa" w:w="1728"/>
-          </w:tcPr>
-          <w:p/>
-        </w:tc>
-        <w:tc>
-          <w:tcPr>
-            <w:tcW w:type="dxa" w:w="1728"/>
-          </w:tcPr>
-          <w:p/>
         </w:tc>
       </w:tr>
       <w:tr>
@@ -1270,10 +1054,10 @@
     </w:p>
     <w:p>
       <w:pPr>
-        <w:pStyle w:val="Heading1"/>
+        <w:pStyle w:val="Heading2"/>
       </w:pPr>
       <w:r>
-        <w:t>5. Before vs after the screening threshold (all folds, n = 768)</w:t>
+        <w:t>Before vs after the screening threshold (all folds, n = 768)</w:t>
       </w:r>
     </w:p>
     <w:tbl>
@@ -1411,342 +1195,6 @@
               <w:t>FP @HR</w:t>
             </w:r>
           </w:p>
-        </w:tc>
-      </w:tr>
-      <w:tr>
-        <w:tc>
-          <w:tcPr>
-            <w:tcW w:type="dxa" w:w="960"/>
-          </w:tcPr>
-          <w:p/>
-        </w:tc>
-        <w:tc>
-          <w:tcPr>
-            <w:tcW w:type="dxa" w:w="960"/>
-          </w:tcPr>
-          <w:p/>
-        </w:tc>
-        <w:tc>
-          <w:tcPr>
-            <w:tcW w:type="dxa" w:w="960"/>
-          </w:tcPr>
-          <w:p/>
-        </w:tc>
-        <w:tc>
-          <w:tcPr>
-            <w:tcW w:type="dxa" w:w="960"/>
-          </w:tcPr>
-          <w:p/>
-        </w:tc>
-        <w:tc>
-          <w:tcPr>
-            <w:tcW w:type="dxa" w:w="960"/>
-          </w:tcPr>
-          <w:p/>
-        </w:tc>
-        <w:tc>
-          <w:tcPr>
-            <w:tcW w:type="dxa" w:w="960"/>
-          </w:tcPr>
-          <w:p/>
-        </w:tc>
-        <w:tc>
-          <w:tcPr>
-            <w:tcW w:type="dxa" w:w="960"/>
-          </w:tcPr>
-          <w:p/>
-        </w:tc>
-        <w:tc>
-          <w:tcPr>
-            <w:tcW w:type="dxa" w:w="960"/>
-          </w:tcPr>
-          <w:p/>
-        </w:tc>
-        <w:tc>
-          <w:tcPr>
-            <w:tcW w:type="dxa" w:w="960"/>
-          </w:tcPr>
-          <w:p/>
-        </w:tc>
-      </w:tr>
-      <w:tr>
-        <w:tc>
-          <w:tcPr>
-            <w:tcW w:type="dxa" w:w="960"/>
-          </w:tcPr>
-          <w:p/>
-        </w:tc>
-        <w:tc>
-          <w:tcPr>
-            <w:tcW w:type="dxa" w:w="960"/>
-          </w:tcPr>
-          <w:p/>
-        </w:tc>
-        <w:tc>
-          <w:tcPr>
-            <w:tcW w:type="dxa" w:w="960"/>
-          </w:tcPr>
-          <w:p/>
-        </w:tc>
-        <w:tc>
-          <w:tcPr>
-            <w:tcW w:type="dxa" w:w="960"/>
-          </w:tcPr>
-          <w:p/>
-        </w:tc>
-        <w:tc>
-          <w:tcPr>
-            <w:tcW w:type="dxa" w:w="960"/>
-          </w:tcPr>
-          <w:p/>
-        </w:tc>
-        <w:tc>
-          <w:tcPr>
-            <w:tcW w:type="dxa" w:w="960"/>
-          </w:tcPr>
-          <w:p/>
-        </w:tc>
-        <w:tc>
-          <w:tcPr>
-            <w:tcW w:type="dxa" w:w="960"/>
-          </w:tcPr>
-          <w:p/>
-        </w:tc>
-        <w:tc>
-          <w:tcPr>
-            <w:tcW w:type="dxa" w:w="960"/>
-          </w:tcPr>
-          <w:p/>
-        </w:tc>
-        <w:tc>
-          <w:tcPr>
-            <w:tcW w:type="dxa" w:w="960"/>
-          </w:tcPr>
-          <w:p/>
-        </w:tc>
-      </w:tr>
-      <w:tr>
-        <w:tc>
-          <w:tcPr>
-            <w:tcW w:type="dxa" w:w="960"/>
-          </w:tcPr>
-          <w:p/>
-        </w:tc>
-        <w:tc>
-          <w:tcPr>
-            <w:tcW w:type="dxa" w:w="960"/>
-          </w:tcPr>
-          <w:p/>
-        </w:tc>
-        <w:tc>
-          <w:tcPr>
-            <w:tcW w:type="dxa" w:w="960"/>
-          </w:tcPr>
-          <w:p/>
-        </w:tc>
-        <w:tc>
-          <w:tcPr>
-            <w:tcW w:type="dxa" w:w="960"/>
-          </w:tcPr>
-          <w:p/>
-        </w:tc>
-        <w:tc>
-          <w:tcPr>
-            <w:tcW w:type="dxa" w:w="960"/>
-          </w:tcPr>
-          <w:p/>
-        </w:tc>
-        <w:tc>
-          <w:tcPr>
-            <w:tcW w:type="dxa" w:w="960"/>
-          </w:tcPr>
-          <w:p/>
-        </w:tc>
-        <w:tc>
-          <w:tcPr>
-            <w:tcW w:type="dxa" w:w="960"/>
-          </w:tcPr>
-          <w:p/>
-        </w:tc>
-        <w:tc>
-          <w:tcPr>
-            <w:tcW w:type="dxa" w:w="960"/>
-          </w:tcPr>
-          <w:p/>
-        </w:tc>
-        <w:tc>
-          <w:tcPr>
-            <w:tcW w:type="dxa" w:w="960"/>
-          </w:tcPr>
-          <w:p/>
-        </w:tc>
-      </w:tr>
-      <w:tr>
-        <w:tc>
-          <w:tcPr>
-            <w:tcW w:type="dxa" w:w="960"/>
-          </w:tcPr>
-          <w:p/>
-        </w:tc>
-        <w:tc>
-          <w:tcPr>
-            <w:tcW w:type="dxa" w:w="960"/>
-          </w:tcPr>
-          <w:p/>
-        </w:tc>
-        <w:tc>
-          <w:tcPr>
-            <w:tcW w:type="dxa" w:w="960"/>
-          </w:tcPr>
-          <w:p/>
-        </w:tc>
-        <w:tc>
-          <w:tcPr>
-            <w:tcW w:type="dxa" w:w="960"/>
-          </w:tcPr>
-          <w:p/>
-        </w:tc>
-        <w:tc>
-          <w:tcPr>
-            <w:tcW w:type="dxa" w:w="960"/>
-          </w:tcPr>
-          <w:p/>
-        </w:tc>
-        <w:tc>
-          <w:tcPr>
-            <w:tcW w:type="dxa" w:w="960"/>
-          </w:tcPr>
-          <w:p/>
-        </w:tc>
-        <w:tc>
-          <w:tcPr>
-            <w:tcW w:type="dxa" w:w="960"/>
-          </w:tcPr>
-          <w:p/>
-        </w:tc>
-        <w:tc>
-          <w:tcPr>
-            <w:tcW w:type="dxa" w:w="960"/>
-          </w:tcPr>
-          <w:p/>
-        </w:tc>
-        <w:tc>
-          <w:tcPr>
-            <w:tcW w:type="dxa" w:w="960"/>
-          </w:tcPr>
-          <w:p/>
-        </w:tc>
-      </w:tr>
-      <w:tr>
-        <w:tc>
-          <w:tcPr>
-            <w:tcW w:type="dxa" w:w="960"/>
-          </w:tcPr>
-          <w:p/>
-        </w:tc>
-        <w:tc>
-          <w:tcPr>
-            <w:tcW w:type="dxa" w:w="960"/>
-          </w:tcPr>
-          <w:p/>
-        </w:tc>
-        <w:tc>
-          <w:tcPr>
-            <w:tcW w:type="dxa" w:w="960"/>
-          </w:tcPr>
-          <w:p/>
-        </w:tc>
-        <w:tc>
-          <w:tcPr>
-            <w:tcW w:type="dxa" w:w="960"/>
-          </w:tcPr>
-          <w:p/>
-        </w:tc>
-        <w:tc>
-          <w:tcPr>
-            <w:tcW w:type="dxa" w:w="960"/>
-          </w:tcPr>
-          <w:p/>
-        </w:tc>
-        <w:tc>
-          <w:tcPr>
-            <w:tcW w:type="dxa" w:w="960"/>
-          </w:tcPr>
-          <w:p/>
-        </w:tc>
-        <w:tc>
-          <w:tcPr>
-            <w:tcW w:type="dxa" w:w="960"/>
-          </w:tcPr>
-          <w:p/>
-        </w:tc>
-        <w:tc>
-          <w:tcPr>
-            <w:tcW w:type="dxa" w:w="960"/>
-          </w:tcPr>
-          <w:p/>
-        </w:tc>
-        <w:tc>
-          <w:tcPr>
-            <w:tcW w:type="dxa" w:w="960"/>
-          </w:tcPr>
-          <w:p/>
-        </w:tc>
-      </w:tr>
-      <w:tr>
-        <w:tc>
-          <w:tcPr>
-            <w:tcW w:type="dxa" w:w="960"/>
-          </w:tcPr>
-          <w:p/>
-        </w:tc>
-        <w:tc>
-          <w:tcPr>
-            <w:tcW w:type="dxa" w:w="960"/>
-          </w:tcPr>
-          <w:p/>
-        </w:tc>
-        <w:tc>
-          <w:tcPr>
-            <w:tcW w:type="dxa" w:w="960"/>
-          </w:tcPr>
-          <w:p/>
-        </w:tc>
-        <w:tc>
-          <w:tcPr>
-            <w:tcW w:type="dxa" w:w="960"/>
-          </w:tcPr>
-          <w:p/>
-        </w:tc>
-        <w:tc>
-          <w:tcPr>
-            <w:tcW w:type="dxa" w:w="960"/>
-          </w:tcPr>
-          <w:p/>
-        </w:tc>
-        <w:tc>
-          <w:tcPr>
-            <w:tcW w:type="dxa" w:w="960"/>
-          </w:tcPr>
-          <w:p/>
-        </w:tc>
-        <w:tc>
-          <w:tcPr>
-            <w:tcW w:type="dxa" w:w="960"/>
-          </w:tcPr>
-          <w:p/>
-        </w:tc>
-        <w:tc>
-          <w:tcPr>
-            <w:tcW w:type="dxa" w:w="960"/>
-          </w:tcPr>
-          <w:p/>
-        </w:tc>
-        <w:tc>
-          <w:tcPr>
-            <w:tcW w:type="dxa" w:w="960"/>
-          </w:tcPr>
-          <w:p/>
         </w:tc>
       </w:tr>
       <w:tr>
@@ -2388,38 +1836,6 @@
           <w:tcPr>
             <w:tcW w:type="dxa" w:w="1728"/>
           </w:tcPr>
-          <w:p/>
-        </w:tc>
-        <w:tc>
-          <w:tcPr>
-            <w:tcW w:type="dxa" w:w="1728"/>
-          </w:tcPr>
-          <w:p/>
-        </w:tc>
-        <w:tc>
-          <w:tcPr>
-            <w:tcW w:type="dxa" w:w="1728"/>
-          </w:tcPr>
-          <w:p/>
-        </w:tc>
-        <w:tc>
-          <w:tcPr>
-            <w:tcW w:type="dxa" w:w="1728"/>
-          </w:tcPr>
-          <w:p/>
-        </w:tc>
-        <w:tc>
-          <w:tcPr>
-            <w:tcW w:type="dxa" w:w="1728"/>
-          </w:tcPr>
-          <w:p/>
-        </w:tc>
-      </w:tr>
-      <w:tr>
-        <w:tc>
-          <w:tcPr>
-            <w:tcW w:type="dxa" w:w="1728"/>
-          </w:tcPr>
           <w:p>
             <w:r/>
           </w:p>
@@ -2486,7 +1902,7 @@
         <w:drawing>
           <wp:inline xmlns:a="http://schemas.openxmlformats.org/drawingml/2006/main" xmlns:pic="http://schemas.openxmlformats.org/drawingml/2006/picture">
             <wp:extent cx="5943600" cy="2197014"/>
-            <wp:docPr id="1" name="Picture 1"/>
+            <wp:docPr id="5" name="Picture 5"/>
             <wp:cNvGraphicFramePr>
               <a:graphicFrameLocks noChangeAspect="1"/>
             </wp:cNvGraphicFramePr>
@@ -2498,7 +1914,7 @@
                     <pic:cNvPicPr/>
                   </pic:nvPicPr>
                   <pic:blipFill>
-                    <a:blip r:embed="rId9"/>
+                    <a:blip r:embed="rId13"/>
                     <a:stretch>
                       <a:fillRect/>
                     </a:stretch>
@@ -2522,7 +1938,7 @@
         <w:pStyle w:val="Heading1"/>
       </w:pPr>
       <w:r>
-        <w:t>6. Model comparison — is the difference real?</w:t>
+        <w:t>6. Risk trends — how each predictor moves diabetes risk</w:t>
       </w:r>
     </w:p>
     <w:p>
@@ -2530,7 +1946,95 @@
         <w:rPr>
           <w:b w:val="0"/>
         </w:rPr>
-        <w:t>Per-fold paired differences (LogReg all-features minus RF k=12): ROC-AUC +0.007 ± 0.021, F1@0.5 −0.005 ± 0.036, recall@HR +0.015 ± 0.055, F1@HR +0.009 ± 0.022. The sign flips across folds and the spread dwarfs the mean gaps, so the two models are statistically indistinguishable on averaged metrics.</w:t>
+        <w:t>Main takeaway: diabetes risk rises steadily with glucose — observed prevalence climbs from ~5% at glucose 50-90 mg/dL to ~82% above ~155 mg/dL, with the model's risk curve tracking the same monotonic climb. Glucose x Age and BMI show the same upward shape; Insulin x BMI jumps once insulin resistance crosses ~4,000 then plateaus; Age rises then flattens (older members of this 1994 cohort were diagnosed earlier in life); QUICKI (insulin sensitivity) is flat/non-monotonic in this cohort — a real negative finding.</w:t>
+      </w:r>
+    </w:p>
+    <w:p>
+      <w:r>
+        <w:drawing>
+          <wp:inline xmlns:a="http://schemas.openxmlformats.org/drawingml/2006/main" xmlns:pic="http://schemas.openxmlformats.org/drawingml/2006/picture">
+            <wp:extent cx="5943600" cy="3164112"/>
+            <wp:docPr id="6" name="Picture 6"/>
+            <wp:cNvGraphicFramePr>
+              <a:graphicFrameLocks noChangeAspect="1"/>
+            </wp:cNvGraphicFramePr>
+            <a:graphic>
+              <a:graphicData uri="http://schemas.openxmlformats.org/drawingml/2006/picture">
+                <pic:pic>
+                  <pic:nvPicPr>
+                    <pic:cNvPr id="0" name="risk_curves.png"/>
+                    <pic:cNvPicPr/>
+                  </pic:nvPicPr>
+                  <pic:blipFill>
+                    <a:blip r:embed="rId14"/>
+                    <a:stretch>
+                      <a:fillRect/>
+                    </a:stretch>
+                  </pic:blipFill>
+                  <pic:spPr>
+                    <a:xfrm>
+                      <a:off x="0" y="0"/>
+                      <a:ext cx="5943600" cy="3164112"/>
+                    </a:xfrm>
+                    <a:prstGeom prst="rect"/>
+                  </pic:spPr>
+                </pic:pic>
+              </a:graphicData>
+            </a:graphic>
+          </wp:inline>
+        </w:drawing>
+      </w:r>
+    </w:p>
+    <w:p>
+      <w:r>
+        <w:drawing>
+          <wp:inline xmlns:a="http://schemas.openxmlformats.org/drawingml/2006/main" xmlns:pic="http://schemas.openxmlformats.org/drawingml/2006/picture">
+            <wp:extent cx="4389120" cy="3141340"/>
+            <wp:docPr id="7" name="Picture 7"/>
+            <wp:cNvGraphicFramePr>
+              <a:graphicFrameLocks noChangeAspect="1"/>
+            </wp:cNvGraphicFramePr>
+            <a:graphic>
+              <a:graphicData uri="http://schemas.openxmlformats.org/drawingml/2006/picture">
+                <pic:pic>
+                  <pic:nvPicPr>
+                    <pic:cNvPr id="0" name="logreg_direction.png"/>
+                    <pic:cNvPicPr/>
+                  </pic:nvPicPr>
+                  <pic:blipFill>
+                    <a:blip r:embed="rId15"/>
+                    <a:stretch>
+                      <a:fillRect/>
+                    </a:stretch>
+                  </pic:blipFill>
+                  <pic:spPr>
+                    <a:xfrm>
+                      <a:off x="0" y="0"/>
+                      <a:ext cx="4389120" cy="3141340"/>
+                    </a:xfrm>
+                    <a:prstGeom prst="rect"/>
+                  </pic:spPr>
+                </pic:pic>
+              </a:graphicData>
+            </a:graphic>
+          </wp:inline>
+        </w:drawing>
+      </w:r>
+    </w:p>
+    <w:p>
+      <w:pPr>
+        <w:pStyle w:val="Heading1"/>
+      </w:pPr>
+      <w:r>
+        <w:t>7. Model comparison — is the difference real?</w:t>
+      </w:r>
+    </w:p>
+    <w:p>
+      <w:r>
+        <w:rPr>
+          <w:b w:val="0"/>
+        </w:rPr>
+        <w:t>Per-fold paired differences (LogReg all-features minus RF k=12): ROC-AUC +0.007 +/- 0.021, F1@0.5 -0.005 +/- 0.036, recall@HR +0.015 +/- 0.055, F1@HR +0.009 +/- 0.022. The sign flips across folds and the spread dwarfs the mean gaps, so the two models are statistically indistinguishable on averaged metrics.</w:t>
       </w:r>
     </w:p>
     <w:p>
@@ -2546,7 +2050,7 @@
         <w:pStyle w:val="Heading1"/>
       </w:pPr>
       <w:r>
-        <w:t>7. Model strengths and weaknesses</w:t>
+        <w:t>8. Model strengths and weaknesses</w:t>
       </w:r>
     </w:p>
     <w:p>
@@ -2562,7 +2066,7 @@
         <w:rPr>
           <w:b w:val="0"/>
         </w:rPr>
-        <w:t>- Highest ROC-AUC overall (0.8415); only config reaching the 90% screening target (recall 0.899)</w:t>
+        <w:t>- Highest ROC-AUC overall (0.8415); only configuration reaching the 90% screening target (recall 0.899)</w:t>
       </w:r>
     </w:p>
     <w:p>
@@ -2602,7 +2106,7 @@
         <w:rPr>
           <w:b w:val="0"/>
         </w:rPr>
-        <w:t>- Linear/additive structure can under-fit interactions — mitigated here by explicit interaction features, but a risk if features were reduced to the raw 8</w:t>
+        <w:t>- Linear/additive structure can under-fit interactions — mitigated by explicit interaction features, but a risk if reduced to the raw 8 inputs</w:t>
       </w:r>
     </w:p>
     <w:p>
@@ -2642,7 +2146,7 @@
         <w:rPr>
           <w:b w:val="0"/>
         </w:rPr>
-        <w:t>- Recall at the screening threshold only reaches 0.869-0.884: it misses the 90% target, i.e. it leaves more diabetics undetected — the exact error a screening tool must minimise</w:t>
+        <w:t>- Recall at the screening threshold only reaches 0.869-0.884: it misses the 90% target, leaving more diabetics undetected — the exact error a screening tool must minimise</w:t>
       </w:r>
     </w:p>
     <w:p>
@@ -2658,7 +2162,7 @@
         <w:pStyle w:val="Heading1"/>
       </w:pPr>
       <w:r>
-        <w:t>8. Overall performance and verdict</w:t>
+        <w:t>9. Overall performance and verdict</w:t>
       </w:r>
     </w:p>
     <w:p>
@@ -2666,7 +2170,7 @@
         <w:rPr>
           <w:b w:val="0"/>
         </w:rPr>
-        <w:t>Ranking quality is statistically tied (~0.84 ROC-AUC for both model families). For the stated medical screening objective (minimise missed diabetics), the recommended model is Logistic Regression on all 25 engineered features with the 0.343 screening threshold: recall 0.899, precision 0.541, and missed cases reduced from 407 to 180 across five folds. RandomForest k=12 remains the better choice for a precision-oriented triage setting. The LogReg-over-RF margin is not proven at this sample size (5 folds, 768 rows); repeated stratified CV (e.g. 10x5) is the natural next step.</w:t>
+        <w:t>Ranking quality is statistically tied (~0.84 ROC-AUC for both model families). For the stated medical screening objective (minimise missed diabetics), the recommended model is Logistic Regression on all 25 engineered features with the 0.343 screening threshold: recall 0.899, precision 0.541, and missed cases reduced from 407 to 180 across five folds. RandomForest k=12 remains the better choice for a precision-oriented triage setting. The LogReg-over-RF margin is not proven at this sample size (5 folds, 768 rows); repeated stratified CV (10x5) is the natural next step.</w:t>
       </w:r>
     </w:p>
     <w:p>

</xml_diff>